<commit_message>
Notarial act frontend — form, page, sidebar, i18n
</commit_message>
<xml_diff>
--- a/backend/templates/notarial-act.docx
+++ b/backend/templates/notarial-act.docx
@@ -1890,6 +1890,15 @@
             </w:r>
             <w:r>
               <w:rPr>
+                <w:rFonts w:ascii="Georgia" w:hAnsi="Georgia" w:cs="Georgia"/>
+                <w:sz w:val="21"/>
+                <w:szCs w:val="21"/>
+                <w:lang w:val="bg-BG" w:eastAsia="bg-BG"/>
+              </w:rPr>
+              <w:t xml:space="preserve">– </w:t>
+            </w:r>
+            <w:r>
+              <w:rPr>
                 <w:rFonts w:ascii="Georgia" w:eastAsia="Calibri" w:hAnsi="Georgia"/>
                 <w:sz w:val="21"/>
                 <w:szCs w:val="21"/>
@@ -3778,9 +3787,7 @@
             <w:pPr>
               <w:jc w:val="both"/>
               <w:rPr>
-                <w:rFonts w:ascii="Georgia" w:hAnsi="Georgia"/>
-                <w:b/>
-                <w:bCs/>
+                <w:rFonts w:ascii="Georgia" w:eastAsia="Calibri" w:hAnsi="Georgia"/>
                 <w:sz w:val="21"/>
                 <w:szCs w:val="21"/>
                 <w:lang w:val="en-US" w:eastAsia="bg-BG"/>
@@ -4459,14 +4466,14 @@
                 <w:szCs w:val="21"/>
                 <w:lang w:val="bg-BG" w:eastAsia="bg-BG"/>
               </w:rPr>
-              <w:t>-----------------------------------------</w:t>
+              <w:t>-------------------------------</w:t>
             </w:r>
           </w:p>
           <w:p>
             <w:pPr>
               <w:jc w:val="both"/>
               <w:rPr>
-                <w:rFonts w:ascii="Georgia" w:hAnsi="Georgia" w:cs="Georgia"/>
+                <w:rFonts w:ascii="Georgia" w:hAnsi="Georgia"/>
                 <w:b/>
                 <w:bCs/>
                 <w:sz w:val="21"/>
@@ -4476,11 +4483,10 @@
             </w:pPr>
             <w:r>
               <w:rPr>
-                <w:rFonts w:ascii="Georgia" w:hAnsi="Georgia"/>
-                <w:b/>
-                <w:sz w:val="21"/>
-                <w:szCs w:val="21"/>
-                <w:lang w:val="bg-BG" w:eastAsia="bg-BG"/>
+                <w:rFonts w:ascii="Georgia" w:eastAsia="Calibri" w:hAnsi="Georgia"/>
+                <w:sz w:val="21"/>
+                <w:szCs w:val="21"/>
+                <w:lang w:val="en-US" w:eastAsia="bg-BG"/>
               </w:rPr>
               <w:t xml:space="preserve">           </w:t>
             </w:r>

</xml_diff>